<commit_message>
Actualiza la tabla de calificación en los informes
Co-Authored-By: Claude Opus 5.5 <noreply@anthropic.com>
Claude-Session: https://claude.ai/code/session_01XoDZLsg3S6BNvJBdoo6Rq7
</commit_message>
<xml_diff>
--- a/informes/Informe_entrevista_Andrew_Rueda.docx
+++ b/informes/Informe_entrevista_Andrew_Rueda.docx
@@ -999,67 +999,423 @@
         </w:rPr>
       </w:pPr>
     </w:p>
-    <w:p>
-      <w:pPr>
+    <w:tbl>
+      <w:tblPr>
+        <w:tblW w:w="5400" w:type="dxa"/>
         <w:jc w:val="center"/>
-        <w:rPr>
-          <w:rFonts w:ascii="Roboto Slab" w:eastAsia="Roboto Slab" w:hAnsi="Roboto Slab" w:cs="Roboto Slab"/>
-        </w:rPr>
-      </w:pPr>
-      <w:r>
-        <w:rPr>
-          <w:noProof/>
-        </w:rPr>
-        <w:drawing>
-          <wp:inline distT="0" distB="0" distL="0" distR="0" wp14:anchorId="46365A8F" wp14:editId="2E3D0301">
-            <wp:extent cx="4267200" cy="1352550"/>
-            <wp:effectExtent l="0" t="0" r="0" b="0"/>
-            <wp:docPr id="2" name="Imagen 2"/>
-            <wp:cNvGraphicFramePr>
-              <a:graphicFrameLocks xmlns:a="http://schemas.openxmlformats.org/drawingml/2006/main" noChangeAspect="1"/>
-            </wp:cNvGraphicFramePr>
-            <a:graphic xmlns:a="http://schemas.openxmlformats.org/drawingml/2006/main">
-              <a:graphicData uri="http://schemas.openxmlformats.org/drawingml/2006/picture">
-                <pic:pic xmlns:pic="http://schemas.openxmlformats.org/drawingml/2006/picture">
-                  <pic:nvPicPr>
-                    <pic:cNvPr id="0" name="Picture 1"/>
-                    <pic:cNvPicPr>
-                      <a:picLocks noChangeAspect="1" noChangeArrowheads="1"/>
-                    </pic:cNvPicPr>
-                  </pic:nvPicPr>
-                  <pic:blipFill>
-                    <a:blip r:embed="rId11">
-                      <a:extLst>
-                        <a:ext uri="{28A0092B-C50C-407E-A947-70E740481C1C}">
-                          <a14:useLocalDpi xmlns:a14="http://schemas.microsoft.com/office/drawing/2010/main" val="0"/>
-                        </a:ext>
-                      </a:extLst>
-                    </a:blip>
-                    <a:srcRect/>
-                    <a:stretch>
-                      <a:fillRect/>
-                    </a:stretch>
-                  </pic:blipFill>
-                  <pic:spPr bwMode="auto">
-                    <a:xfrm>
-                      <a:off x="0" y="0"/>
-                      <a:ext cx="4267200" cy="1352550"/>
-                    </a:xfrm>
-                    <a:prstGeom prst="rect">
-                      <a:avLst/>
-                    </a:prstGeom>
-                    <a:noFill/>
-                    <a:ln>
-                      <a:noFill/>
-                    </a:ln>
-                  </pic:spPr>
-                </pic:pic>
-              </a:graphicData>
-            </a:graphic>
-          </wp:inline>
-        </w:drawing>
-      </w:r>
-    </w:p>
+        <w:tblBorders>
+          <w:top w:val="single" w:sz="4" w:space="0" w:color="808080"/>
+          <w:left w:val="single" w:sz="4" w:space="0" w:color="808080"/>
+          <w:bottom w:val="single" w:sz="4" w:space="0" w:color="808080"/>
+          <w:right w:val="single" w:sz="4" w:space="0" w:color="808080"/>
+          <w:insideH w:val="single" w:sz="4" w:space="0" w:color="808080"/>
+          <w:insideV w:val="single" w:sz="4" w:space="0" w:color="808080"/>
+        </w:tblBorders>
+        <w:tblLayout w:type="fixed"/>
+      </w:tblPr>
+      <w:tblGrid>
+        <w:gridCol w:w="1000"/>
+        <w:gridCol w:w="1000"/>
+        <w:gridCol w:w="3400"/>
+      </w:tblGrid>
+      <w:tr>
+        <w:tc>
+          <w:tcPr>
+            <w:tcW w:w="5400" w:type="dxa"/>
+            <w:gridSpan w:val="3"/>
+            <w:shd w:val="clear" w:color="auto" w:fill="F2F2F2"/>
+            <w:vAlign w:val="center"/>
+          </w:tcPr>
+          <w:p>
+            <w:pPr>
+              <w:spacing w:before="30" w:after="30" w:line="240" w:lineRule="auto"/>
+              <w:jc w:val="center"/>
+            </w:pPr>
+            <w:r>
+              <w:rPr>
+                <w:rFonts w:ascii="Roboto Slab" w:eastAsia="Roboto Slab" w:hAnsi="Roboto Slab" w:cs="Roboto Slab"/>
+                <w:b/>
+                <w:bCs/>
+                <w:color w:val="C55A11"/>
+                <w:sz w:val="19"/>
+                <w:szCs w:val="19"/>
+              </w:rPr>
+              <w:t xml:space="preserve">Tabla de calificación</w:t>
+            </w:r>
+          </w:p>
+        </w:tc>
+      </w:tr>
+      <w:tr>
+        <w:tc>
+          <w:tcPr>
+            <w:tcW w:w="1000" w:type="dxa"/>
+            <w:shd w:val="clear" w:color="auto" w:fill="D9D9D9"/>
+            <w:vAlign w:val="center"/>
+          </w:tcPr>
+          <w:p>
+            <w:pPr>
+              <w:spacing w:before="30" w:after="30" w:line="240" w:lineRule="auto"/>
+              <w:jc w:val="center"/>
+            </w:pPr>
+            <w:r>
+              <w:rPr>
+                <w:rFonts w:ascii="Roboto Slab" w:eastAsia="Roboto Slab" w:hAnsi="Roboto Slab" w:cs="Roboto Slab"/>
+                <w:b/>
+                <w:bCs/>
+                <w:color w:val="000000"/>
+                <w:sz w:val="19"/>
+                <w:szCs w:val="19"/>
+              </w:rPr>
+              <w:t xml:space="preserve">Desde</w:t>
+            </w:r>
+          </w:p>
+        </w:tc>
+        <w:tc>
+          <w:tcPr>
+            <w:tcW w:w="1000" w:type="dxa"/>
+            <w:shd w:val="clear" w:color="auto" w:fill="D9D9D9"/>
+            <w:vAlign w:val="center"/>
+          </w:tcPr>
+          <w:p>
+            <w:pPr>
+              <w:spacing w:before="30" w:after="30" w:line="240" w:lineRule="auto"/>
+              <w:jc w:val="center"/>
+            </w:pPr>
+            <w:r>
+              <w:rPr>
+                <w:rFonts w:ascii="Roboto Slab" w:eastAsia="Roboto Slab" w:hAnsi="Roboto Slab" w:cs="Roboto Slab"/>
+                <w:b/>
+                <w:bCs/>
+                <w:color w:val="000000"/>
+                <w:sz w:val="19"/>
+                <w:szCs w:val="19"/>
+              </w:rPr>
+              <w:t xml:space="preserve">Hasta</w:t>
+            </w:r>
+          </w:p>
+        </w:tc>
+        <w:tc>
+          <w:tcPr>
+            <w:tcW w:w="3400" w:type="dxa"/>
+            <w:shd w:val="clear" w:color="auto" w:fill="D9D9D9"/>
+            <w:vAlign w:val="center"/>
+          </w:tcPr>
+          <w:p>
+            <w:pPr>
+              <w:spacing w:before="30" w:after="30" w:line="240" w:lineRule="auto"/>
+              <w:jc w:val="center"/>
+            </w:pPr>
+            <w:r>
+              <w:rPr>
+                <w:rFonts w:ascii="Roboto Slab" w:eastAsia="Roboto Slab" w:hAnsi="Roboto Slab" w:cs="Roboto Slab"/>
+                <w:b/>
+                <w:bCs/>
+                <w:color w:val="000000"/>
+                <w:sz w:val="19"/>
+                <w:szCs w:val="19"/>
+              </w:rPr>
+              <w:t xml:space="preserve">Clasificación</w:t>
+            </w:r>
+          </w:p>
+        </w:tc>
+      </w:tr>
+      <w:tr>
+        <w:tc>
+          <w:tcPr>
+            <w:tcW w:w="1000" w:type="dxa"/>
+            <w:shd w:val="clear" w:color="auto" w:fill="FFC7CE"/>
+            <w:vAlign w:val="center"/>
+          </w:tcPr>
+          <w:p>
+            <w:pPr>
+              <w:spacing w:before="30" w:after="30" w:line="240" w:lineRule="auto"/>
+              <w:jc w:val="center"/>
+            </w:pPr>
+            <w:r>
+              <w:rPr>
+                <w:rFonts w:ascii="Roboto Slab" w:eastAsia="Roboto Slab" w:hAnsi="Roboto Slab" w:cs="Roboto Slab"/>
+                <w:b/>
+                <w:bCs/>
+                <w:color w:val="9C0006"/>
+                <w:sz w:val="19"/>
+                <w:szCs w:val="19"/>
+              </w:rPr>
+              <w:t xml:space="preserve">0</w:t>
+            </w:r>
+          </w:p>
+        </w:tc>
+        <w:tc>
+          <w:tcPr>
+            <w:tcW w:w="1000" w:type="dxa"/>
+            <w:shd w:val="clear" w:color="auto" w:fill="FFC7CE"/>
+            <w:vAlign w:val="center"/>
+          </w:tcPr>
+          <w:p>
+            <w:pPr>
+              <w:spacing w:before="30" w:after="30" w:line="240" w:lineRule="auto"/>
+              <w:jc w:val="center"/>
+            </w:pPr>
+            <w:r>
+              <w:rPr>
+                <w:rFonts w:ascii="Roboto Slab" w:eastAsia="Roboto Slab" w:hAnsi="Roboto Slab" w:cs="Roboto Slab"/>
+                <w:b/>
+                <w:bCs/>
+                <w:color w:val="9C0006"/>
+                <w:sz w:val="19"/>
+                <w:szCs w:val="19"/>
+              </w:rPr>
+              <w:t xml:space="preserve">60</w:t>
+            </w:r>
+          </w:p>
+        </w:tc>
+        <w:tc>
+          <w:tcPr>
+            <w:tcW w:w="3400" w:type="dxa"/>
+            <w:shd w:val="clear" w:color="auto" w:fill="FFC7CE"/>
+            <w:vAlign w:val="center"/>
+          </w:tcPr>
+          <w:p>
+            <w:pPr>
+              <w:spacing w:before="30" w:after="30" w:line="240" w:lineRule="auto"/>
+              <w:jc w:val="center"/>
+            </w:pPr>
+            <w:r>
+              <w:rPr>
+                <w:rFonts w:ascii="Roboto Slab" w:eastAsia="Roboto Slab" w:hAnsi="Roboto Slab" w:cs="Roboto Slab"/>
+                <w:b/>
+                <w:bCs/>
+                <w:color w:val="9C0006"/>
+                <w:sz w:val="19"/>
+                <w:szCs w:val="19"/>
+              </w:rPr>
+              <w:t xml:space="preserve">No aceptado</w:t>
+            </w:r>
+          </w:p>
+        </w:tc>
+      </w:tr>
+      <w:tr>
+        <w:tc>
+          <w:tcPr>
+            <w:tcW w:w="1000" w:type="dxa"/>
+            <w:shd w:val="clear" w:color="auto" w:fill="FCE4D6"/>
+            <w:vAlign w:val="center"/>
+          </w:tcPr>
+          <w:p>
+            <w:pPr>
+              <w:spacing w:before="30" w:after="30" w:line="240" w:lineRule="auto"/>
+              <w:jc w:val="center"/>
+            </w:pPr>
+            <w:r>
+              <w:rPr>
+                <w:rFonts w:ascii="Roboto Slab" w:eastAsia="Roboto Slab" w:hAnsi="Roboto Slab" w:cs="Roboto Slab"/>
+                <w:b/>
+                <w:bCs/>
+                <w:color w:val="843C0C"/>
+                <w:sz w:val="19"/>
+                <w:szCs w:val="19"/>
+              </w:rPr>
+              <w:t xml:space="preserve">60</w:t>
+            </w:r>
+          </w:p>
+        </w:tc>
+        <w:tc>
+          <w:tcPr>
+            <w:tcW w:w="1000" w:type="dxa"/>
+            <w:shd w:val="clear" w:color="auto" w:fill="FCE4D6"/>
+            <w:vAlign w:val="center"/>
+          </w:tcPr>
+          <w:p>
+            <w:pPr>
+              <w:spacing w:before="30" w:after="30" w:line="240" w:lineRule="auto"/>
+              <w:jc w:val="center"/>
+            </w:pPr>
+            <w:r>
+              <w:rPr>
+                <w:rFonts w:ascii="Roboto Slab" w:eastAsia="Roboto Slab" w:hAnsi="Roboto Slab" w:cs="Roboto Slab"/>
+                <w:b/>
+                <w:bCs/>
+                <w:color w:val="843C0C"/>
+                <w:sz w:val="19"/>
+                <w:szCs w:val="19"/>
+              </w:rPr>
+              <w:t xml:space="preserve">80</w:t>
+            </w:r>
+          </w:p>
+        </w:tc>
+        <w:tc>
+          <w:tcPr>
+            <w:tcW w:w="3400" w:type="dxa"/>
+            <w:shd w:val="clear" w:color="auto" w:fill="FCE4D6"/>
+            <w:vAlign w:val="center"/>
+          </w:tcPr>
+          <w:p>
+            <w:pPr>
+              <w:spacing w:before="30" w:after="30" w:line="240" w:lineRule="auto"/>
+              <w:jc w:val="center"/>
+            </w:pPr>
+            <w:r>
+              <w:rPr>
+                <w:rFonts w:ascii="Roboto Slab" w:eastAsia="Roboto Slab" w:hAnsi="Roboto Slab" w:cs="Roboto Slab"/>
+                <w:b/>
+                <w:bCs/>
+                <w:color w:val="843C0C"/>
+                <w:sz w:val="19"/>
+                <w:szCs w:val="19"/>
+              </w:rPr>
+              <w:t xml:space="preserve">Ingeniero Software IA JR</w:t>
+            </w:r>
+          </w:p>
+        </w:tc>
+      </w:tr>
+      <w:tr>
+        <w:tc>
+          <w:tcPr>
+            <w:tcW w:w="1000" w:type="dxa"/>
+            <w:shd w:val="clear" w:color="auto" w:fill="FFEB9C"/>
+            <w:vAlign w:val="center"/>
+          </w:tcPr>
+          <w:p>
+            <w:pPr>
+              <w:spacing w:before="30" w:after="30" w:line="240" w:lineRule="auto"/>
+              <w:jc w:val="center"/>
+            </w:pPr>
+            <w:r>
+              <w:rPr>
+                <w:rFonts w:ascii="Roboto Slab" w:eastAsia="Roboto Slab" w:hAnsi="Roboto Slab" w:cs="Roboto Slab"/>
+                <w:b/>
+                <w:bCs/>
+                <w:color w:val="7F6000"/>
+                <w:sz w:val="19"/>
+                <w:szCs w:val="19"/>
+              </w:rPr>
+              <w:t xml:space="preserve">80</w:t>
+            </w:r>
+          </w:p>
+        </w:tc>
+        <w:tc>
+          <w:tcPr>
+            <w:tcW w:w="1000" w:type="dxa"/>
+            <w:shd w:val="clear" w:color="auto" w:fill="FFEB9C"/>
+            <w:vAlign w:val="center"/>
+          </w:tcPr>
+          <w:p>
+            <w:pPr>
+              <w:spacing w:before="30" w:after="30" w:line="240" w:lineRule="auto"/>
+              <w:jc w:val="center"/>
+            </w:pPr>
+            <w:r>
+              <w:rPr>
+                <w:rFonts w:ascii="Roboto Slab" w:eastAsia="Roboto Slab" w:hAnsi="Roboto Slab" w:cs="Roboto Slab"/>
+                <w:b/>
+                <w:bCs/>
+                <w:color w:val="7F6000"/>
+                <w:sz w:val="19"/>
+                <w:szCs w:val="19"/>
+              </w:rPr>
+              <w:t xml:space="preserve">90</w:t>
+            </w:r>
+          </w:p>
+        </w:tc>
+        <w:tc>
+          <w:tcPr>
+            <w:tcW w:w="3400" w:type="dxa"/>
+            <w:shd w:val="clear" w:color="auto" w:fill="FFEB9C"/>
+            <w:vAlign w:val="center"/>
+          </w:tcPr>
+          <w:p>
+            <w:pPr>
+              <w:spacing w:before="30" w:after="30" w:line="240" w:lineRule="auto"/>
+              <w:jc w:val="center"/>
+            </w:pPr>
+            <w:r>
+              <w:rPr>
+                <w:rFonts w:ascii="Roboto Slab" w:eastAsia="Roboto Slab" w:hAnsi="Roboto Slab" w:cs="Roboto Slab"/>
+                <w:b/>
+                <w:bCs/>
+                <w:color w:val="7F6000"/>
+                <w:sz w:val="19"/>
+                <w:szCs w:val="19"/>
+              </w:rPr>
+              <w:t xml:space="preserve">Ingeniero Software IA SSR</w:t>
+            </w:r>
+          </w:p>
+        </w:tc>
+      </w:tr>
+      <w:tr>
+        <w:tc>
+          <w:tcPr>
+            <w:tcW w:w="1000" w:type="dxa"/>
+            <w:shd w:val="clear" w:color="auto" w:fill="C6EFCE"/>
+            <w:vAlign w:val="center"/>
+          </w:tcPr>
+          <w:p>
+            <w:pPr>
+              <w:spacing w:before="30" w:after="30" w:line="240" w:lineRule="auto"/>
+              <w:jc w:val="center"/>
+            </w:pPr>
+            <w:r>
+              <w:rPr>
+                <w:rFonts w:ascii="Roboto Slab" w:eastAsia="Roboto Slab" w:hAnsi="Roboto Slab" w:cs="Roboto Slab"/>
+                <w:b/>
+                <w:bCs/>
+                <w:color w:val="006100"/>
+                <w:sz w:val="19"/>
+                <w:szCs w:val="19"/>
+              </w:rPr>
+              <w:t xml:space="preserve">90</w:t>
+            </w:r>
+          </w:p>
+        </w:tc>
+        <w:tc>
+          <w:tcPr>
+            <w:tcW w:w="1000" w:type="dxa"/>
+            <w:shd w:val="clear" w:color="auto" w:fill="C6EFCE"/>
+            <w:vAlign w:val="center"/>
+          </w:tcPr>
+          <w:p>
+            <w:pPr>
+              <w:spacing w:before="30" w:after="30" w:line="240" w:lineRule="auto"/>
+              <w:jc w:val="center"/>
+            </w:pPr>
+            <w:r>
+              <w:rPr>
+                <w:rFonts w:ascii="Roboto Slab" w:eastAsia="Roboto Slab" w:hAnsi="Roboto Slab" w:cs="Roboto Slab"/>
+                <w:b/>
+                <w:bCs/>
+                <w:color w:val="006100"/>
+                <w:sz w:val="19"/>
+                <w:szCs w:val="19"/>
+              </w:rPr>
+              <w:t xml:space="preserve">100</w:t>
+            </w:r>
+          </w:p>
+        </w:tc>
+        <w:tc>
+          <w:tcPr>
+            <w:tcW w:w="3400" w:type="dxa"/>
+            <w:shd w:val="clear" w:color="auto" w:fill="C6EFCE"/>
+            <w:vAlign w:val="center"/>
+          </w:tcPr>
+          <w:p>
+            <w:pPr>
+              <w:spacing w:before="30" w:after="30" w:line="240" w:lineRule="auto"/>
+              <w:jc w:val="center"/>
+            </w:pPr>
+            <w:r>
+              <w:rPr>
+                <w:rFonts w:ascii="Roboto Slab" w:eastAsia="Roboto Slab" w:hAnsi="Roboto Slab" w:cs="Roboto Slab"/>
+                <w:b/>
+                <w:bCs/>
+                <w:color w:val="006100"/>
+                <w:sz w:val="19"/>
+                <w:szCs w:val="19"/>
+              </w:rPr>
+              <w:t xml:space="preserve">Ingeniero Software IA SR</w:t>
+            </w:r>
+          </w:p>
+        </w:tc>
+      </w:tr>
+    </w:tbl>
     <w:p>
       <w:pPr>
         <w:rPr>
@@ -1166,7 +1522,7 @@
                 <w:sz w:val="22"/>
                 <w:szCs w:val="22"/>
               </w:rPr>
-              <w:t xml:space="preserve">JUNIOR SÓLIDO – 68 %</w:t>
+              <w:t xml:space="preserve">ING. SOFTWARE IA JR – 68 %</w:t>
             </w:r>
           </w:p>
         </w:tc>

</xml_diff>